<commit_message>
fix: harden document comparison (#679)
</commit_message>
<xml_diff>
--- a/apps/api/src/testing/fixtures/doc-engine/change-model.docx
+++ b/apps/api/src/testing/fixtures/doc-engine/change-model.docx
@@ -88,6 +88,26 @@
             </w:ins>
           </w:p>
         </w:tc>
+        <w:tc>
+          <w:p>
+            <w:r>
+              <w:t>Outer table cell</w:t>
+            </w:r>
+          </w:p>
+          <w:tbl>
+            <w:tr>
+              <w:tc>
+                <w:p>
+                  <w:del w:id="6" w:author="Counsel" w:date="2026-08-14T09:00:00Z">
+                    <w:r>
+                      <w:delText>Nested removed text</w:delText>
+                    </w:r>
+                  </w:del>
+                </w:p>
+              </w:tc>
+            </w:tr>
+          </w:tbl>
+        </w:tc>
       </w:tr>
     </w:tbl>
   </w:body>

</xml_diff>